<commit_message>
Documento: nombre del estudiante, 22 nodos, 20 pruebas y trigger Webhook en el diagrama
Co-Authored-By: Claude Opus 5.5 <noreply@anthropic.com>
</commit_message>
<xml_diff>
--- a/docs/documento-logica-negocio.docx
+++ b/docs/documento-logica-negocio.docx
@@ -46,7 +46,7 @@
           <w:sz w:val="20"/>
           <w:szCs w:val="20"/>
         </w:rPr>
-        <w:t xml:space="preserve">[Nombre del estudiante]</w:t>
+        <w:t xml:space="preserve">Victor Gonzalez</w:t>
       </w:r>
       <w:r>
         <w:rPr>
@@ -151,7 +151,7 @@
         <w:jc w:val="both"/>
       </w:pPr>
       <w:r>
-        <w:t xml:space="preserve">El workflow tiene 21 nodos (incluida una nota con el resumen de reglas). El diagrama muestra el recorrido de los datos; los colores indican el tipo de nodo:</w:t>
+        <w:t xml:space="preserve">El workflow tiene 22 nodos (incluida una nota con el resumen de reglas). El diagrama muestra el recorrido de los datos; los colores indican el tipo de nodo:</w:t>
       </w:r>
     </w:p>
     <w:p>
@@ -213,7 +213,7 @@
         <w:t xml:space="preserve">Recorrido.</w:t>
       </w:r>
       <w:r>
-        <w:t xml:space="preserve"> El trigger (Schedule diario o Manual para la demo) pasa por </w:t>
+        <w:t xml:space="preserve"> Cualquiera de los tres triggers (Schedule diario a las 7:00, Manual, o el Webhook que usa el panel web) pasa por </w:t>
       </w:r>
       <w:r>
         <w:rPr>
@@ -2468,7 +2468,19 @@
         <w:jc w:val="both"/>
       </w:pPr>
       <w:r>
-        <w:t xml:space="preserve">Modelé el escenario con cuatro clases en JavaScript puro, cada una con una sola responsabilidad:</w:t>
+        <w:t xml:space="preserve">Modelé el escenario con cuatro clases principales en JavaScript puro, cada una con una sola responsabilidad (una quinta, </w:t>
+      </w:r>
+      <w:r>
+        <w:rPr>
+          <w:rFonts w:ascii="Consolas" w:cs="Consolas" w:eastAsia="Consolas" w:hAnsi="Consolas"/>
+          <w:color w:val="9A3412"/>
+          <w:sz w:val="19"/>
+          <w:szCs w:val="19"/>
+        </w:rPr>
+        <w:t xml:space="preserve">DiagnosticoProveedor</w:t>
+      </w:r>
+      <w:r>
+        <w:t xml:space="preserve">, reutiliza estas reglas para la consulta del panel web):</w:t>
       </w:r>
     </w:p>
     <w:p>
@@ -3023,17 +3035,24 @@
     </w:p>
     <w:p>
       <w:pPr>
-        <w:pStyle w:val="Heading1"/>
-      </w:pPr>
-      <w:r>
-        <w:t xml:space="preserve">6. Pruebas realizadas</w:t>
-      </w:r>
-    </w:p>
-    <w:p>
-      <w:pPr>
-        <w:spacing w:after="100" w:line="276"/>
+        <w:pStyle w:val="ListParagraph"/>
+        <w:numPr>
+          <w:ilvl w:val="0"/>
+          <w:numId w:val="2"/>
+        </w:numPr>
+        <w:spacing w:after="40" w:line="264"/>
         <w:jc w:val="both"/>
       </w:pPr>
+      <w:r>
+        <w:rPr>
+          <w:b/>
+          <w:bCs/>
+        </w:rPr>
+        <w:t xml:space="preserve">Agregado opcional: panel web.</w:t>
+      </w:r>
+      <w:r>
+        <w:t xml:space="preserve"> Una página servida por JSON Server permite consultar una cédula, ver el historial con hora de Costa Rica, ver los comprobantes QR y lanzar la revisión. No tiene lógica propia: llama a webhooks de n8n que usan las mismas clases (</w:t>
+      </w:r>
       <w:r>
         <w:rPr>
           <w:rFonts w:ascii="Consolas" w:cs="Consolas" w:eastAsia="Consolas" w:hAnsi="Consolas"/>
@@ -3041,10 +3060,36 @@
           <w:sz w:val="19"/>
           <w:szCs w:val="19"/>
         </w:rPr>
+        <w:t xml:space="preserve">DiagnosticoProveedor</w:t>
+      </w:r>
+      <w:r>
+        <w:t xml:space="preserve"> para la consulta).</w:t>
+      </w:r>
+    </w:p>
+    <w:p>
+      <w:pPr>
+        <w:pStyle w:val="Heading1"/>
+      </w:pPr>
+      <w:r>
+        <w:t xml:space="preserve">6. Pruebas realizadas</w:t>
+      </w:r>
+    </w:p>
+    <w:p>
+      <w:pPr>
+        <w:spacing w:after="100" w:line="276"/>
+        <w:jc w:val="both"/>
+      </w:pPr>
+      <w:r>
+        <w:rPr>
+          <w:rFonts w:ascii="Consolas" w:cs="Consolas" w:eastAsia="Consolas" w:hAnsi="Consolas"/>
+          <w:color w:val="9A3412"/>
+          <w:sz w:val="19"/>
+          <w:szCs w:val="19"/>
+        </w:rPr>
         <w:t xml:space="preserve">npm test</w:t>
       </w:r>
       <w:r>
-        <w:t xml:space="preserve"> ejecuta 15 pruebas automatizadas que cubren las reglas R1 a R9 y los errores E1 a E4 (E5 y E6 dependen de servicios caídos y se probaron directamente en n8n). </w:t>
+        <w:t xml:space="preserve"> ejecuta 20 pruebas automatizadas que cubren las reglas R1 a R9, los errores E1 a E4 y la consulta de cédula del panel (E5 y E6 dependen de servicios caídos y se probaron directamente en n8n). </w:t>
       </w:r>
       <w:r>
         <w:rPr>

</xml_diff>

<commit_message>
POO: jerarquía de reglas, GitHub Actions y capturas en el README
- ReglaNegocio (abstracta) con ReglaRetencion y ReglaRevisionManual; R1, R2, R3, R4, R6 y R7 como subclases
- EvaluadorRiesgo aplica las reglas por polimorfismo; listas reemplazables sin modificar la clase
- 6 pruebas nuevas de abstracción, herencia, polimorfismo y encapsulamiento (26 en total)
- GitHub Actions: pruebas, main.js y verificación de que los workflows están generados desde src/
- README con insignia, diagrama de clases y capturas del panel; documento con los pilares de POO

Co-Authored-By: Claude Opus 5.5 <noreply@anthropic.com>
</commit_message>
<xml_diff>
--- a/docs/documento-logica-negocio.docx
+++ b/docs/documento-logica-negocio.docx
@@ -2468,7 +2468,7 @@
         <w:jc w:val="both"/>
       </w:pPr>
       <w:r>
-        <w:t xml:space="preserve">Modelé el escenario con cuatro clases principales en JavaScript puro, cada una con una sola responsabilidad (una quinta, </w:t>
+        <w:t xml:space="preserve">Modelé el escenario con clases en JavaScript puro, cada una con una sola responsabilidad (</w:t>
       </w:r>
       <w:r>
         <w:rPr>
@@ -2480,7 +2480,7 @@
         <w:t xml:space="preserve">DiagnosticoProveedor</w:t>
       </w:r>
       <w:r>
-        <w:t xml:space="preserve">, reutiliza estas reglas para la consulta del panel web):</w:t>
+        <w:t xml:space="preserve"> reutiliza estas mismas reglas para la consulta del panel web):</w:t>
       </w:r>
     </w:p>
     <w:p>
@@ -2641,10 +2641,69 @@
           <w:sz w:val="19"/>
           <w:szCs w:val="19"/>
         </w:rPr>
+        <w:t xml:space="preserve">ReglaNegocio</w:t>
+      </w:r>
+      <w:r>
+        <w:t xml:space="preserve"> y sus subclases: cada regla (R1, R2, R3, R4, R6, R7) es una clase que hereda de </w:t>
+      </w:r>
+      <w:r>
+        <w:rPr>
+          <w:rFonts w:ascii="Consolas" w:cs="Consolas" w:eastAsia="Consolas" w:hAnsi="Consolas"/>
+          <w:color w:val="9A3412"/>
+          <w:sz w:val="19"/>
+          <w:szCs w:val="19"/>
+        </w:rPr>
+        <w:t xml:space="preserve">ReglaRetencion</w:t>
+      </w:r>
+      <w:r>
+        <w:t xml:space="preserve"> o </w:t>
+      </w:r>
+      <w:r>
+        <w:rPr>
+          <w:rFonts w:ascii="Consolas" w:cs="Consolas" w:eastAsia="Consolas" w:hAnsi="Consolas"/>
+          <w:color w:val="9A3412"/>
+          <w:sz w:val="19"/>
+          <w:szCs w:val="19"/>
+        </w:rPr>
+        <w:t xml:space="preserve">ReglaRevisionManual</w:t>
+      </w:r>
+      <w:r>
+        <w:t xml:space="preserve">, y estas de </w:t>
+      </w:r>
+      <w:r>
+        <w:rPr>
+          <w:rFonts w:ascii="Consolas" w:cs="Consolas" w:eastAsia="Consolas" w:hAnsi="Consolas"/>
+          <w:color w:val="9A3412"/>
+          <w:sz w:val="19"/>
+          <w:szCs w:val="19"/>
+        </w:rPr>
+        <w:t xml:space="preserve">ReglaNegocio</w:t>
+      </w:r>
+      <w:r>
+        <w:t xml:space="preserve">.</w:t>
+      </w:r>
+    </w:p>
+    <w:p>
+      <w:pPr>
+        <w:pStyle w:val="ListParagraph"/>
+        <w:numPr>
+          <w:ilvl w:val="0"/>
+          <w:numId w:val="2"/>
+        </w:numPr>
+        <w:spacing w:after="40" w:line="264"/>
+        <w:jc w:val="both"/>
+      </w:pPr>
+      <w:r>
+        <w:rPr>
+          <w:rFonts w:ascii="Consolas" w:cs="Consolas" w:eastAsia="Consolas" w:hAnsi="Consolas"/>
+          <w:color w:val="9A3412"/>
+          <w:sz w:val="19"/>
+          <w:szCs w:val="19"/>
+        </w:rPr>
         <w:t xml:space="preserve">EvaluadorRiesgo</w:t>
       </w:r>
       <w:r>
-        <w:t xml:space="preserve">: coordina a las otras tres. Tiene dos métodos que corresponden uno a uno con los dos nodos Code: </w:t>
+        <w:t xml:space="preserve">: coordina a las demás. Tiene dos métodos que corresponden uno a uno con los dos nodos Code: </w:t>
       </w:r>
       <w:r>
         <w:rPr>
@@ -2829,6 +2888,714 @@
     </w:p>
     <w:p>
       <w:pPr>
+        <w:spacing w:after="100" w:line="276"/>
+        <w:jc w:val="both"/>
+      </w:pPr>
+      <w:r>
+        <w:rPr>
+          <w:b/>
+          <w:bCs/>
+        </w:rPr>
+        <w:t xml:space="preserve">Los cuatro pilares de POO.</w:t>
+      </w:r>
+      <w:r>
+        <w:t xml:space="preserve"> La jerarquía de reglas es donde mejor se ven:</w:t>
+      </w:r>
+    </w:p>
+    <w:tbl>
+      <w:tblPr>
+        <w:tblW w:type="dxa" w:w="9360"/>
+        <w:tblBorders>
+          <w:top w:val="single" w:color="auto" w:sz="4"/>
+          <w:left w:val="single" w:color="auto" w:sz="4"/>
+          <w:bottom w:val="single" w:color="auto" w:sz="4"/>
+          <w:right w:val="single" w:color="auto" w:sz="4"/>
+          <w:insideH w:val="single" w:color="auto" w:sz="4"/>
+          <w:insideV w:val="single" w:color="auto" w:sz="4"/>
+        </w:tblBorders>
+      </w:tblPr>
+      <w:tblGrid>
+        <w:gridCol w:w="1700"/>
+        <w:gridCol w:w="7660"/>
+      </w:tblGrid>
+      <w:tr>
+        <w:trPr>
+          <w:tblHeader/>
+        </w:trPr>
+        <w:tc>
+          <w:tcPr>
+            <w:tcW w:type="dxa" w:w="1700"/>
+            <w:tcBorders>
+              <w:top w:val="single" w:color="CBD5E1" w:sz="4"/>
+              <w:left w:val="single" w:color="CBD5E1" w:sz="4"/>
+              <w:bottom w:val="single" w:color="CBD5E1" w:sz="4"/>
+              <w:right w:val="single" w:color="CBD5E1" w:sz="4"/>
+            </w:tcBorders>
+            <w:shd w:fill="1E3A8A" w:color="auto" w:val="clear"/>
+            <w:tcMar>
+              <w:top w:type="dxa" w:w="50"/>
+              <w:left w:type="dxa" w:w="90"/>
+              <w:bottom w:type="dxa" w:w="50"/>
+              <w:right w:type="dxa" w:w="90"/>
+            </w:tcMar>
+          </w:tcPr>
+          <w:p>
+            <w:pPr>
+              <w:spacing w:after="0"/>
+            </w:pPr>
+            <w:r>
+              <w:rPr>
+                <w:b/>
+                <w:bCs/>
+                <w:color w:val="FFFFFF"/>
+                <w:sz w:val="17"/>
+                <w:szCs w:val="17"/>
+              </w:rPr>
+              <w:t xml:space="preserve">Pilar</w:t>
+            </w:r>
+          </w:p>
+        </w:tc>
+        <w:tc>
+          <w:tcPr>
+            <w:tcW w:type="dxa" w:w="7660"/>
+            <w:tcBorders>
+              <w:top w:val="single" w:color="CBD5E1" w:sz="4"/>
+              <w:left w:val="single" w:color="CBD5E1" w:sz="4"/>
+              <w:bottom w:val="single" w:color="CBD5E1" w:sz="4"/>
+              <w:right w:val="single" w:color="CBD5E1" w:sz="4"/>
+            </w:tcBorders>
+            <w:shd w:fill="1E3A8A" w:color="auto" w:val="clear"/>
+            <w:tcMar>
+              <w:top w:type="dxa" w:w="50"/>
+              <w:left w:type="dxa" w:w="90"/>
+              <w:bottom w:type="dxa" w:w="50"/>
+              <w:right w:type="dxa" w:w="90"/>
+            </w:tcMar>
+          </w:tcPr>
+          <w:p>
+            <w:pPr>
+              <w:spacing w:after="0"/>
+            </w:pPr>
+            <w:r>
+              <w:rPr>
+                <w:b/>
+                <w:bCs/>
+                <w:color w:val="FFFFFF"/>
+                <w:sz w:val="17"/>
+                <w:szCs w:val="17"/>
+              </w:rPr>
+              <w:t xml:space="preserve">Cómo se aplica en el proyecto</w:t>
+            </w:r>
+          </w:p>
+        </w:tc>
+      </w:tr>
+      <w:tr>
+        <w:tc>
+          <w:tcPr>
+            <w:tcW w:type="dxa" w:w="1700"/>
+            <w:tcBorders>
+              <w:top w:val="single" w:color="CBD5E1" w:sz="4"/>
+              <w:left w:val="single" w:color="CBD5E1" w:sz="4"/>
+              <w:bottom w:val="single" w:color="CBD5E1" w:sz="4"/>
+              <w:right w:val="single" w:color="CBD5E1" w:sz="4"/>
+            </w:tcBorders>
+            <w:tcMar>
+              <w:top w:type="dxa" w:w="50"/>
+              <w:left w:type="dxa" w:w="90"/>
+              <w:bottom w:type="dxa" w:w="50"/>
+              <w:right w:type="dxa" w:w="90"/>
+            </w:tcMar>
+          </w:tcPr>
+          <w:p>
+            <w:pPr>
+              <w:spacing w:after="0"/>
+            </w:pPr>
+            <w:r>
+              <w:rPr>
+                <w:b w:val="false"/>
+                <w:bCs w:val="false"/>
+                <w:color w:val="1F2937"/>
+                <w:sz w:val="17"/>
+                <w:szCs w:val="17"/>
+              </w:rPr>
+              <w:t xml:space="preserve">Abstracción</w:t>
+            </w:r>
+          </w:p>
+        </w:tc>
+        <w:tc>
+          <w:tcPr>
+            <w:tcW w:type="dxa" w:w="7660"/>
+            <w:tcBorders>
+              <w:top w:val="single" w:color="CBD5E1" w:sz="4"/>
+              <w:left w:val="single" w:color="CBD5E1" w:sz="4"/>
+              <w:bottom w:val="single" w:color="CBD5E1" w:sz="4"/>
+              <w:right w:val="single" w:color="CBD5E1" w:sz="4"/>
+            </w:tcBorders>
+            <w:tcMar>
+              <w:top w:type="dxa" w:w="50"/>
+              <w:left w:type="dxa" w:w="90"/>
+              <w:bottom w:type="dxa" w:w="50"/>
+              <w:right w:type="dxa" w:w="90"/>
+            </w:tcMar>
+          </w:tcPr>
+          <w:p>
+            <w:pPr>
+              <w:spacing w:after="0"/>
+            </w:pPr>
+            <w:r>
+              <w:rPr>
+                <w:rFonts w:ascii="Consolas" w:cs="Consolas" w:eastAsia="Consolas" w:hAnsi="Consolas"/>
+                <w:color w:val="9A3412"/>
+                <w:sz w:val="16"/>
+                <w:szCs w:val="16"/>
+              </w:rPr>
+              <w:t xml:space="preserve">ReglaNegocio</w:t>
+            </w:r>
+            <w:r>
+              <w:rPr>
+                <w:b w:val="false"/>
+                <w:bCs w:val="false"/>
+                <w:color w:val="1F2937"/>
+                <w:sz w:val="17"/>
+                <w:szCs w:val="17"/>
+              </w:rPr>
+              <w:t xml:space="preserve">, </w:t>
+            </w:r>
+            <w:r>
+              <w:rPr>
+                <w:rFonts w:ascii="Consolas" w:cs="Consolas" w:eastAsia="Consolas" w:hAnsi="Consolas"/>
+                <w:color w:val="9A3412"/>
+                <w:sz w:val="16"/>
+                <w:szCs w:val="16"/>
+              </w:rPr>
+              <w:t xml:space="preserve">ReglaRetencion</w:t>
+            </w:r>
+            <w:r>
+              <w:rPr>
+                <w:b w:val="false"/>
+                <w:bCs w:val="false"/>
+                <w:color w:val="1F2937"/>
+                <w:sz w:val="17"/>
+                <w:szCs w:val="17"/>
+              </w:rPr>
+              <w:t xml:space="preserve"> y </w:t>
+            </w:r>
+            <w:r>
+              <w:rPr>
+                <w:rFonts w:ascii="Consolas" w:cs="Consolas" w:eastAsia="Consolas" w:hAnsi="Consolas"/>
+                <w:color w:val="9A3412"/>
+                <w:sz w:val="16"/>
+                <w:szCs w:val="16"/>
+              </w:rPr>
+              <w:t xml:space="preserve">ReglaRevisionManual</w:t>
+            </w:r>
+            <w:r>
+              <w:rPr>
+                <w:b w:val="false"/>
+                <w:bCs w:val="false"/>
+                <w:color w:val="1F2937"/>
+                <w:sz w:val="17"/>
+                <w:szCs w:val="17"/>
+              </w:rPr>
+              <w:t xml:space="preserve"> son abstractas: lanzan un error si se intentan instanciar y obligan a cada regla a implementar </w:t>
+            </w:r>
+            <w:r>
+              <w:rPr>
+                <w:rFonts w:ascii="Consolas" w:cs="Consolas" w:eastAsia="Consolas" w:hAnsi="Consolas"/>
+                <w:color w:val="9A3412"/>
+                <w:sz w:val="16"/>
+                <w:szCs w:val="16"/>
+              </w:rPr>
+              <w:t xml:space="preserve">aplica()</w:t>
+            </w:r>
+            <w:r>
+              <w:rPr>
+                <w:b w:val="false"/>
+                <w:bCs w:val="false"/>
+                <w:color w:val="1F2937"/>
+                <w:sz w:val="17"/>
+                <w:szCs w:val="17"/>
+              </w:rPr>
+              <w:t xml:space="preserve"> y </w:t>
+            </w:r>
+            <w:r>
+              <w:rPr>
+                <w:rFonts w:ascii="Consolas" w:cs="Consolas" w:eastAsia="Consolas" w:hAnsi="Consolas"/>
+                <w:color w:val="9A3412"/>
+                <w:sz w:val="16"/>
+                <w:szCs w:val="16"/>
+              </w:rPr>
+              <w:t xml:space="preserve">motivo()</w:t>
+            </w:r>
+            <w:r>
+              <w:rPr>
+                <w:b w:val="false"/>
+                <w:bCs w:val="false"/>
+                <w:color w:val="1F2937"/>
+                <w:sz w:val="17"/>
+                <w:szCs w:val="17"/>
+              </w:rPr>
+              <w:t xml:space="preserve">.</w:t>
+            </w:r>
+          </w:p>
+        </w:tc>
+      </w:tr>
+      <w:tr>
+        <w:tc>
+          <w:tcPr>
+            <w:tcW w:type="dxa" w:w="1700"/>
+            <w:tcBorders>
+              <w:top w:val="single" w:color="CBD5E1" w:sz="4"/>
+              <w:left w:val="single" w:color="CBD5E1" w:sz="4"/>
+              <w:bottom w:val="single" w:color="CBD5E1" w:sz="4"/>
+              <w:right w:val="single" w:color="CBD5E1" w:sz="4"/>
+            </w:tcBorders>
+            <w:tcMar>
+              <w:top w:type="dxa" w:w="50"/>
+              <w:left w:type="dxa" w:w="90"/>
+              <w:bottom w:type="dxa" w:w="50"/>
+              <w:right w:type="dxa" w:w="90"/>
+            </w:tcMar>
+          </w:tcPr>
+          <w:p>
+            <w:pPr>
+              <w:spacing w:after="0"/>
+            </w:pPr>
+            <w:r>
+              <w:rPr>
+                <w:b w:val="false"/>
+                <w:bCs w:val="false"/>
+                <w:color w:val="1F2937"/>
+                <w:sz w:val="17"/>
+                <w:szCs w:val="17"/>
+              </w:rPr>
+              <w:t xml:space="preserve">Herencia</w:t>
+            </w:r>
+          </w:p>
+        </w:tc>
+        <w:tc>
+          <w:tcPr>
+            <w:tcW w:type="dxa" w:w="7660"/>
+            <w:tcBorders>
+              <w:top w:val="single" w:color="CBD5E1" w:sz="4"/>
+              <w:left w:val="single" w:color="CBD5E1" w:sz="4"/>
+              <w:bottom w:val="single" w:color="CBD5E1" w:sz="4"/>
+              <w:right w:val="single" w:color="CBD5E1" w:sz="4"/>
+            </w:tcBorders>
+            <w:tcMar>
+              <w:top w:type="dxa" w:w="50"/>
+              <w:left w:type="dxa" w:w="90"/>
+              <w:bottom w:type="dxa" w:w="50"/>
+              <w:right w:type="dxa" w:w="90"/>
+            </w:tcMar>
+          </w:tcPr>
+          <w:p>
+            <w:pPr>
+              <w:spacing w:after="0"/>
+            </w:pPr>
+            <w:r>
+              <w:rPr>
+                <w:rFonts w:ascii="Consolas" w:cs="Consolas" w:eastAsia="Consolas" w:hAnsi="Consolas"/>
+                <w:color w:val="9A3412"/>
+                <w:sz w:val="16"/>
+                <w:szCs w:val="16"/>
+              </w:rPr>
+              <w:t xml:space="preserve">ReglaMoroso</w:t>
+            </w:r>
+            <w:r>
+              <w:rPr>
+                <w:b w:val="false"/>
+                <w:bCs w:val="false"/>
+                <w:color w:val="1F2937"/>
+                <w:sz w:val="17"/>
+                <w:szCs w:val="17"/>
+              </w:rPr>
+              <w:t xml:space="preserve">, </w:t>
+            </w:r>
+            <w:r>
+              <w:rPr>
+                <w:rFonts w:ascii="Consolas" w:cs="Consolas" w:eastAsia="Consolas" w:hAnsi="Consolas"/>
+                <w:color w:val="9A3412"/>
+                <w:sz w:val="16"/>
+                <w:szCs w:val="16"/>
+              </w:rPr>
+              <w:t xml:space="preserve">ReglaOmiso</w:t>
+            </w:r>
+            <w:r>
+              <w:rPr>
+                <w:b w:val="false"/>
+                <w:bCs w:val="false"/>
+                <w:color w:val="1F2937"/>
+                <w:sz w:val="17"/>
+                <w:szCs w:val="17"/>
+              </w:rPr>
+              <w:t xml:space="preserve">, </w:t>
+            </w:r>
+            <w:r>
+              <w:rPr>
+                <w:rFonts w:ascii="Consolas" w:cs="Consolas" w:eastAsia="Consolas" w:hAnsi="Consolas"/>
+                <w:color w:val="9A3412"/>
+                <w:sz w:val="16"/>
+                <w:szCs w:val="16"/>
+              </w:rPr>
+              <w:t xml:space="preserve">ReglaNoInscrito</w:t>
+            </w:r>
+            <w:r>
+              <w:rPr>
+                <w:b w:val="false"/>
+                <w:bCs w:val="false"/>
+                <w:color w:val="1F2937"/>
+                <w:sz w:val="17"/>
+                <w:szCs w:val="17"/>
+              </w:rPr>
+              <w:t xml:space="preserve">, </w:t>
+            </w:r>
+            <w:r>
+              <w:rPr>
+                <w:rFonts w:ascii="Consolas" w:cs="Consolas" w:eastAsia="Consolas" w:hAnsi="Consolas"/>
+                <w:color w:val="9A3412"/>
+                <w:sz w:val="16"/>
+                <w:szCs w:val="16"/>
+              </w:rPr>
+              <w:t xml:space="preserve">ReglaCedulaInvalida</w:t>
+            </w:r>
+            <w:r>
+              <w:rPr>
+                <w:b w:val="false"/>
+                <w:bCs w:val="false"/>
+                <w:color w:val="1F2937"/>
+                <w:sz w:val="17"/>
+                <w:szCs w:val="17"/>
+              </w:rPr>
+              <w:t xml:space="preserve"> y </w:t>
+            </w:r>
+            <w:r>
+              <w:rPr>
+                <w:rFonts w:ascii="Consolas" w:cs="Consolas" w:eastAsia="Consolas" w:hAnsi="Consolas"/>
+                <w:color w:val="9A3412"/>
+                <w:sz w:val="16"/>
+                <w:szCs w:val="16"/>
+              </w:rPr>
+              <w:t xml:space="preserve">ReglaProveedorInactivo</w:t>
+            </w:r>
+            <w:r>
+              <w:rPr>
+                <w:b w:val="false"/>
+                <w:bCs w:val="false"/>
+                <w:color w:val="1F2937"/>
+                <w:sz w:val="17"/>
+                <w:szCs w:val="17"/>
+              </w:rPr>
+              <w:t xml:space="preserve"> heredan de </w:t>
+            </w:r>
+            <w:r>
+              <w:rPr>
+                <w:rFonts w:ascii="Consolas" w:cs="Consolas" w:eastAsia="Consolas" w:hAnsi="Consolas"/>
+                <w:color w:val="9A3412"/>
+                <w:sz w:val="16"/>
+                <w:szCs w:val="16"/>
+              </w:rPr>
+              <w:t xml:space="preserve">ReglaRetencion</w:t>
+            </w:r>
+            <w:r>
+              <w:rPr>
+                <w:b w:val="false"/>
+                <w:bCs w:val="false"/>
+                <w:color w:val="1F2937"/>
+                <w:sz w:val="17"/>
+                <w:szCs w:val="17"/>
+              </w:rPr>
+              <w:t xml:space="preserve"> (decisión "retenido"); </w:t>
+            </w:r>
+            <w:r>
+              <w:rPr>
+                <w:rFonts w:ascii="Consolas" w:cs="Consolas" w:eastAsia="Consolas" w:hAnsi="Consolas"/>
+                <w:color w:val="9A3412"/>
+                <w:sz w:val="16"/>
+                <w:szCs w:val="16"/>
+              </w:rPr>
+              <w:t xml:space="preserve">ReglaMontoAlto</w:t>
+            </w:r>
+            <w:r>
+              <w:rPr>
+                <w:b w:val="false"/>
+                <w:bCs w:val="false"/>
+                <w:color w:val="1F2937"/>
+                <w:sz w:val="17"/>
+                <w:szCs w:val="17"/>
+              </w:rPr>
+              <w:t xml:space="preserve"> hereda de </w:t>
+            </w:r>
+            <w:r>
+              <w:rPr>
+                <w:rFonts w:ascii="Consolas" w:cs="Consolas" w:eastAsia="Consolas" w:hAnsi="Consolas"/>
+                <w:color w:val="9A3412"/>
+                <w:sz w:val="16"/>
+                <w:szCs w:val="16"/>
+              </w:rPr>
+              <w:t xml:space="preserve">ReglaRevisionManual</w:t>
+            </w:r>
+            <w:r>
+              <w:rPr>
+                <w:b w:val="false"/>
+                <w:bCs w:val="false"/>
+                <w:color w:val="1F2937"/>
+                <w:sz w:val="17"/>
+                <w:szCs w:val="17"/>
+              </w:rPr>
+              <w:t xml:space="preserve">. Todas reciben el método </w:t>
+            </w:r>
+            <w:r>
+              <w:rPr>
+                <w:rFonts w:ascii="Consolas" w:cs="Consolas" w:eastAsia="Consolas" w:hAnsi="Consolas"/>
+                <w:color w:val="9A3412"/>
+                <w:sz w:val="16"/>
+                <w:szCs w:val="16"/>
+              </w:rPr>
+              <w:t xml:space="preserve">evaluar()</w:t>
+            </w:r>
+            <w:r>
+              <w:rPr>
+                <w:b w:val="false"/>
+                <w:bCs w:val="false"/>
+                <w:color w:val="1F2937"/>
+                <w:sz w:val="17"/>
+                <w:szCs w:val="17"/>
+              </w:rPr>
+              <w:t xml:space="preserve"> de </w:t>
+            </w:r>
+            <w:r>
+              <w:rPr>
+                <w:rFonts w:ascii="Consolas" w:cs="Consolas" w:eastAsia="Consolas" w:hAnsi="Consolas"/>
+                <w:color w:val="9A3412"/>
+                <w:sz w:val="16"/>
+                <w:szCs w:val="16"/>
+              </w:rPr>
+              <w:t xml:space="preserve">ReglaNegocio</w:t>
+            </w:r>
+            <w:r>
+              <w:rPr>
+                <w:b w:val="false"/>
+                <w:bCs w:val="false"/>
+                <w:color w:val="1F2937"/>
+                <w:sz w:val="17"/>
+                <w:szCs w:val="17"/>
+              </w:rPr>
+              <w:t xml:space="preserve">.</w:t>
+            </w:r>
+          </w:p>
+        </w:tc>
+      </w:tr>
+      <w:tr>
+        <w:tc>
+          <w:tcPr>
+            <w:tcW w:type="dxa" w:w="1700"/>
+            <w:tcBorders>
+              <w:top w:val="single" w:color="CBD5E1" w:sz="4"/>
+              <w:left w:val="single" w:color="CBD5E1" w:sz="4"/>
+              <w:bottom w:val="single" w:color="CBD5E1" w:sz="4"/>
+              <w:right w:val="single" w:color="CBD5E1" w:sz="4"/>
+            </w:tcBorders>
+            <w:tcMar>
+              <w:top w:type="dxa" w:w="50"/>
+              <w:left w:type="dxa" w:w="90"/>
+              <w:bottom w:type="dxa" w:w="50"/>
+              <w:right w:type="dxa" w:w="90"/>
+            </w:tcMar>
+          </w:tcPr>
+          <w:p>
+            <w:pPr>
+              <w:spacing w:after="0"/>
+            </w:pPr>
+            <w:r>
+              <w:rPr>
+                <w:b w:val="false"/>
+                <w:bCs w:val="false"/>
+                <w:color w:val="1F2937"/>
+                <w:sz w:val="17"/>
+                <w:szCs w:val="17"/>
+              </w:rPr>
+              <w:t xml:space="preserve">Polimorfismo</w:t>
+            </w:r>
+          </w:p>
+        </w:tc>
+        <w:tc>
+          <w:tcPr>
+            <w:tcW w:type="dxa" w:w="7660"/>
+            <w:tcBorders>
+              <w:top w:val="single" w:color="CBD5E1" w:sz="4"/>
+              <w:left w:val="single" w:color="CBD5E1" w:sz="4"/>
+              <w:bottom w:val="single" w:color="CBD5E1" w:sz="4"/>
+              <w:right w:val="single" w:color="CBD5E1" w:sz="4"/>
+            </w:tcBorders>
+            <w:tcMar>
+              <w:top w:type="dxa" w:w="50"/>
+              <w:left w:type="dxa" w:w="90"/>
+              <w:bottom w:type="dxa" w:w="50"/>
+              <w:right w:type="dxa" w:w="90"/>
+            </w:tcMar>
+          </w:tcPr>
+          <w:p>
+            <w:pPr>
+              <w:spacing w:after="0"/>
+            </w:pPr>
+            <w:r>
+              <w:rPr>
+                <w:rFonts w:ascii="Consolas" w:cs="Consolas" w:eastAsia="Consolas" w:hAnsi="Consolas"/>
+                <w:color w:val="9A3412"/>
+                <w:sz w:val="16"/>
+                <w:szCs w:val="16"/>
+              </w:rPr>
+              <w:t xml:space="preserve">EvaluadorRiesgo</w:t>
+            </w:r>
+            <w:r>
+              <w:rPr>
+                <w:b w:val="false"/>
+                <w:bCs w:val="false"/>
+                <w:color w:val="1F2937"/>
+                <w:sz w:val="17"/>
+                <w:szCs w:val="17"/>
+              </w:rPr>
+              <w:t xml:space="preserve"> recorre una lista de reglas y llama </w:t>
+            </w:r>
+            <w:r>
+              <w:rPr>
+                <w:rFonts w:ascii="Consolas" w:cs="Consolas" w:eastAsia="Consolas" w:hAnsi="Consolas"/>
+                <w:color w:val="9A3412"/>
+                <w:sz w:val="16"/>
+                <w:szCs w:val="16"/>
+              </w:rPr>
+              <w:t xml:space="preserve">regla.evaluar(contexto)</w:t>
+            </w:r>
+            <w:r>
+              <w:rPr>
+                <w:b w:val="false"/>
+                <w:bCs w:val="false"/>
+                <w:color w:val="1F2937"/>
+                <w:sz w:val="17"/>
+                <w:szCs w:val="17"/>
+              </w:rPr>
+              <w:t xml:space="preserve"> sin saber cuál es. Para agregar una regla basta con crear otra subclase y sumarla a la lista; una prueba lo demuestra con una regla R10 inventada.</w:t>
+            </w:r>
+          </w:p>
+        </w:tc>
+      </w:tr>
+      <w:tr>
+        <w:tc>
+          <w:tcPr>
+            <w:tcW w:type="dxa" w:w="1700"/>
+            <w:tcBorders>
+              <w:top w:val="single" w:color="CBD5E1" w:sz="4"/>
+              <w:left w:val="single" w:color="CBD5E1" w:sz="4"/>
+              <w:bottom w:val="single" w:color="CBD5E1" w:sz="4"/>
+              <w:right w:val="single" w:color="CBD5E1" w:sz="4"/>
+            </w:tcBorders>
+            <w:tcMar>
+              <w:top w:type="dxa" w:w="50"/>
+              <w:left w:type="dxa" w:w="90"/>
+              <w:bottom w:type="dxa" w:w="50"/>
+              <w:right w:type="dxa" w:w="90"/>
+            </w:tcMar>
+          </w:tcPr>
+          <w:p>
+            <w:pPr>
+              <w:spacing w:after="0"/>
+            </w:pPr>
+            <w:r>
+              <w:rPr>
+                <w:b w:val="false"/>
+                <w:bCs w:val="false"/>
+                <w:color w:val="1F2937"/>
+                <w:sz w:val="17"/>
+                <w:szCs w:val="17"/>
+              </w:rPr>
+              <w:t xml:space="preserve">Encapsulamiento</w:t>
+            </w:r>
+          </w:p>
+        </w:tc>
+        <w:tc>
+          <w:tcPr>
+            <w:tcW w:type="dxa" w:w="7660"/>
+            <w:tcBorders>
+              <w:top w:val="single" w:color="CBD5E1" w:sz="4"/>
+              <w:left w:val="single" w:color="CBD5E1" w:sz="4"/>
+              <w:bottom w:val="single" w:color="CBD5E1" w:sz="4"/>
+              <w:right w:val="single" w:color="CBD5E1" w:sz="4"/>
+            </w:tcBorders>
+            <w:tcMar>
+              <w:top w:type="dxa" w:w="50"/>
+              <w:left w:type="dxa" w:w="90"/>
+              <w:bottom w:type="dxa" w:w="50"/>
+              <w:right w:type="dxa" w:w="90"/>
+            </w:tcMar>
+          </w:tcPr>
+          <w:p>
+            <w:pPr>
+              <w:spacing w:after="0"/>
+            </w:pPr>
+            <w:r>
+              <w:rPr>
+                <w:rFonts w:ascii="Consolas" w:cs="Consolas" w:eastAsia="Consolas" w:hAnsi="Consolas"/>
+                <w:color w:val="9A3412"/>
+                <w:sz w:val="16"/>
+                <w:szCs w:val="16"/>
+              </w:rPr>
+              <w:t xml:space="preserve">Pago</w:t>
+            </w:r>
+            <w:r>
+              <w:rPr>
+                <w:b w:val="false"/>
+                <w:bCs w:val="false"/>
+                <w:color w:val="1F2937"/>
+                <w:sz w:val="17"/>
+                <w:szCs w:val="17"/>
+              </w:rPr>
+              <w:t xml:space="preserve"> solo cambia de estado mediante sus métodos públicos (</w:t>
+            </w:r>
+            <w:r>
+              <w:rPr>
+                <w:rFonts w:ascii="Consolas" w:cs="Consolas" w:eastAsia="Consolas" w:hAnsi="Consolas"/>
+                <w:color w:val="9A3412"/>
+                <w:sz w:val="16"/>
+                <w:szCs w:val="16"/>
+              </w:rPr>
+              <w:t xml:space="preserve">#cambiarEstado</w:t>
+            </w:r>
+            <w:r>
+              <w:rPr>
+                <w:b w:val="false"/>
+                <w:bCs w:val="false"/>
+                <w:color w:val="1F2937"/>
+                <w:sz w:val="17"/>
+                <w:szCs w:val="17"/>
+              </w:rPr>
+              <w:t xml:space="preserve"> es privado) y </w:t>
+            </w:r>
+            <w:r>
+              <w:rPr>
+                <w:rFonts w:ascii="Consolas" w:cs="Consolas" w:eastAsia="Consolas" w:hAnsi="Consolas"/>
+                <w:color w:val="9A3412"/>
+                <w:sz w:val="16"/>
+                <w:szCs w:val="16"/>
+              </w:rPr>
+              <w:t xml:space="preserve">Proveedor</w:t>
+            </w:r>
+            <w:r>
+              <w:rPr>
+                <w:b w:val="false"/>
+                <w:bCs w:val="false"/>
+                <w:color w:val="1F2937"/>
+                <w:sz w:val="17"/>
+                <w:szCs w:val="17"/>
+              </w:rPr>
+              <w:t xml:space="preserve"> interpreta su propia situación tributaria.</w:t>
+            </w:r>
+          </w:p>
+        </w:tc>
+      </w:tr>
+    </w:tbl>
+    <w:p>
+      <w:pPr>
         <w:pStyle w:val="Heading1"/>
       </w:pPr>
       <w:r>
@@ -3089,7 +3856,7 @@
         <w:t xml:space="preserve">npm test</w:t>
       </w:r>
       <w:r>
-        <w:t xml:space="preserve"> ejecuta 20 pruebas automatizadas que cubren las reglas R1 a R9, los errores E1 a E4 y la consulta de cédula del panel (E5 y E6 dependen de servicios caídos y se probaron directamente en n8n). </w:t>
+        <w:t xml:space="preserve"> ejecuta 26 pruebas automatizadas que cubren las reglas R1 a R9, los errores E1 a E4, la consulta de cédula del panel y los pilares de POO (E5 y E6 dependen de servicios caídos y se probaron directamente en n8n). </w:t>
       </w:r>
       <w:r>
         <w:rPr>
@@ -3113,7 +3880,19 @@
         <w:t xml:space="preserve">--en-vivo</w:t>
       </w:r>
       <w:r>
-        <w:t xml:space="preserve"> consulta Hacienda en el momento). El workflow lo ejecuté en n8n 2.38 en cinco escenarios: corrida normal (2 aprobados, 4 retenidos y 3 en revisión; PAG-010, que ya estaba aprobado, ni siquiera se lee), segunda corrida sin pendientes, servicio QR caído y luego recuperado, Hacienda caída tres veces seguidas (hasta llegar a R9) y JSON Server apagado. En todos los casos el estado final en JSON Server coincidió con lo esperado.</w:t>
+        <w:t xml:space="preserve"> consulta Hacienda en el momento). El workflow lo ejecuté en n8n 2.38 en cinco escenarios: corrida normal (2 aprobados, 4 retenidos y 3 en revisión; PAG-010, que ya estaba aprobado, ni siquiera se lee), segunda corrida sin pendientes, servicio QR caído y luego recuperado, Hacienda caída tres veces seguidas (hasta llegar a R9) y JSON Server apagado. En todos los casos el estado final en JSON Server coincidió con lo esperado. Además, GitHub Actions corre las pruebas y </w:t>
+      </w:r>
+      <w:r>
+        <w:rPr>
+          <w:rFonts w:ascii="Consolas" w:cs="Consolas" w:eastAsia="Consolas" w:hAnsi="Consolas"/>
+          <w:color w:val="9A3412"/>
+          <w:sz w:val="19"/>
+          <w:szCs w:val="19"/>
+        </w:rPr>
+        <w:t xml:space="preserve">main.js</w:t>
+      </w:r>
+      <w:r>
+        <w:t xml:space="preserve"> en cada cambio que se sube al repositorio, y verifica que los workflows sigan generados a partir de las clases.</w:t>
       </w:r>
     </w:p>
     <w:sectPr>

</xml_diff>

<commit_message>
Extensión, reto 3: correo de resumen a tesorería
- Clase ResumenRevision: asunto con morosos, secciones por estado y QR de los aprobados (4 pruebas nuevas)
- Nodos Preparar notificación (POO), ¿Hay situaciones críticas? y Enviar correo a tesorería (SMTP)
- Un solo correo por revisión: se arma en la última corrida de la bitácora usando $runIndex
- Documento y README con la extensión y los pasos para activar Gmail

Co-Authored-By: Claude Opus 5.5 <noreply@anthropic.com>
</commit_message>
<xml_diff>
--- a/docs/documento-logica-negocio.docx
+++ b/docs/documento-logica-negocio.docx
@@ -151,7 +151,7 @@
         <w:jc w:val="both"/>
       </w:pPr>
       <w:r>
-        <w:t xml:space="preserve">El workflow tiene 22 nodos (incluida una nota con el resumen de reglas). El diagrama muestra el recorrido de los datos; los colores indican el tipo de nodo:</w:t>
+        <w:t xml:space="preserve">El workflow tiene 26 nodos (incluida una nota con el resumen de reglas). El diagrama muestra el recorrido principal de los datos (sin el aviso por correo de la sección 7); los colores indican el tipo de nodo:</w:t>
       </w:r>
     </w:p>
     <w:p>
@@ -162,7 +162,7 @@
       <w:r>
         <w:drawing>
           <wp:inline distT="0" distB="0" distL="0" distR="0">
-            <wp:extent cx="5429250" cy="4143375"/>
+            <wp:extent cx="5143500" cy="3924300"/>
             <wp:effectExtent t="0" r="0" b="0" l="0"/>
             <wp:docPr id="1" name="diagrama" descr="Recorrido de los datos del workflow" title="Diagrama del workflow"/>
             <wp:cNvGraphicFramePr>
@@ -187,7 +187,7 @@
                   <pic:spPr bwMode="auto">
                     <a:xfrm>
                       <a:off x="0" y="0"/>
-                      <a:ext cx="5429250" cy="4143375"/>
+                      <a:ext cx="5143500" cy="3924300"/>
                     </a:xfrm>
                     <a:prstGeom prst="rect">
                       <a:avLst/>
@@ -2838,7 +2838,7 @@
       <w:r>
         <w:drawing>
           <wp:inline distT="0" distB="0" distL="0" distR="0">
-            <wp:extent cx="1143000" cy="1143000"/>
+            <wp:extent cx="914400" cy="914400"/>
             <wp:effectExtent t="0" r="0" b="0" l="0"/>
             <wp:docPr id="2" name="qr" descr="QR generado para PAG-001" title="Comprobante QR"/>
             <wp:cNvGraphicFramePr>
@@ -2863,7 +2863,7 @@
                   <pic:spPr bwMode="auto">
                     <a:xfrm>
                       <a:off x="0" y="0"/>
-                      <a:ext cx="1143000" cy="1143000"/>
+                      <a:ext cx="914400" cy="914400"/>
                     </a:xfrm>
                     <a:prstGeom prst="rect">
                       <a:avLst/>
@@ -3856,7 +3856,7 @@
         <w:t xml:space="preserve">npm test</w:t>
       </w:r>
       <w:r>
-        <w:t xml:space="preserve"> ejecuta 26 pruebas automatizadas que cubren las reglas R1 a R9, los errores E1 a E4, la consulta de cédula del panel y los pilares de POO (E5 y E6 dependen de servicios caídos y se probaron directamente en n8n). </w:t>
+        <w:t xml:space="preserve"> ejecuta 30 pruebas automatizadas que cubren las reglas R1 a R9, los errores E1 a E4, la consulta de cédula del panel, los pilares de POO y el correo de resumen (E5 y E6 dependen de servicios caídos y se probaron directamente en n8n). </w:t>
       </w:r>
       <w:r>
         <w:rPr>
@@ -3893,6 +3893,150 @@
       </w:r>
       <w:r>
         <w:t xml:space="preserve"> en cada cambio que se sube al repositorio, y verifica que los workflows sigan generados a partir de las clases.</w:t>
+      </w:r>
+    </w:p>
+    <w:p>
+      <w:pPr>
+        <w:pStyle w:val="Heading1"/>
+      </w:pPr>
+      <w:r>
+        <w:t xml:space="preserve">7. Extensión del laboratorio</w:t>
+      </w:r>
+    </w:p>
+    <w:p>
+      <w:pPr>
+        <w:pStyle w:val="ListParagraph"/>
+        <w:numPr>
+          <w:ilvl w:val="0"/>
+          <w:numId w:val="2"/>
+        </w:numPr>
+        <w:spacing w:after="40" w:line="264"/>
+        <w:jc w:val="both"/>
+      </w:pPr>
+      <w:r>
+        <w:rPr>
+          <w:b/>
+          <w:bCs/>
+        </w:rPr>
+        <w:t xml:space="preserve">Reto 1 · Herencia y polimorfismo.</w:t>
+      </w:r>
+      <w:r>
+        <w:t xml:space="preserve"> La jerarquía </w:t>
+      </w:r>
+      <w:r>
+        <w:rPr>
+          <w:rFonts w:ascii="Consolas" w:cs="Consolas" w:eastAsia="Consolas" w:hAnsi="Consolas"/>
+          <w:color w:val="9A3412"/>
+          <w:sz w:val="19"/>
+          <w:szCs w:val="19"/>
+        </w:rPr>
+        <w:t xml:space="preserve">ReglaNegocio</w:t>
+      </w:r>
+      <w:r>
+        <w:t xml:space="preserve"> → </w:t>
+      </w:r>
+      <w:r>
+        <w:rPr>
+          <w:rFonts w:ascii="Consolas" w:cs="Consolas" w:eastAsia="Consolas" w:hAnsi="Consolas"/>
+          <w:color w:val="9A3412"/>
+          <w:sz w:val="19"/>
+          <w:szCs w:val="19"/>
+        </w:rPr>
+        <w:t xml:space="preserve">ReglaRetencion</w:t>
+      </w:r>
+      <w:r>
+        <w:t xml:space="preserve"> / </w:t>
+      </w:r>
+      <w:r>
+        <w:rPr>
+          <w:rFonts w:ascii="Consolas" w:cs="Consolas" w:eastAsia="Consolas" w:hAnsi="Consolas"/>
+          <w:color w:val="9A3412"/>
+          <w:sz w:val="19"/>
+          <w:szCs w:val="19"/>
+        </w:rPr>
+        <w:t xml:space="preserve">ReglaRevisionManual</w:t>
+      </w:r>
+      <w:r>
+        <w:t xml:space="preserve"> → seis reglas concretas que redefinen </w:t>
+      </w:r>
+      <w:r>
+        <w:rPr>
+          <w:rFonts w:ascii="Consolas" w:cs="Consolas" w:eastAsia="Consolas" w:hAnsi="Consolas"/>
+          <w:color w:val="9A3412"/>
+          <w:sz w:val="19"/>
+          <w:szCs w:val="19"/>
+        </w:rPr>
+        <w:t xml:space="preserve">aplica()</w:t>
+      </w:r>
+      <w:r>
+        <w:t xml:space="preserve"> y </w:t>
+      </w:r>
+      <w:r>
+        <w:rPr>
+          <w:rFonts w:ascii="Consolas" w:cs="Consolas" w:eastAsia="Consolas" w:hAnsi="Consolas"/>
+          <w:color w:val="9A3412"/>
+          <w:sz w:val="19"/>
+          <w:szCs w:val="19"/>
+        </w:rPr>
+        <w:t xml:space="preserve">motivo()</w:t>
+      </w:r>
+      <w:r>
+        <w:t xml:space="preserve"> (ver sección 4). Los nodos Code de n8n usan esa misma jerarquía.</w:t>
+      </w:r>
+    </w:p>
+    <w:p>
+      <w:pPr>
+        <w:pStyle w:val="ListParagraph"/>
+        <w:numPr>
+          <w:ilvl w:val="0"/>
+          <w:numId w:val="2"/>
+        </w:numPr>
+        <w:spacing w:after="40" w:line="264"/>
+        <w:jc w:val="both"/>
+      </w:pPr>
+      <w:r>
+        <w:rPr>
+          <w:b/>
+          <w:bCs/>
+        </w:rPr>
+        <w:t xml:space="preserve">Reto 3 · Notificación por correo.</w:t>
+      </w:r>
+      <w:r>
+        <w:t xml:space="preserve"> Al terminar cada revisión, la clase </w:t>
+      </w:r>
+      <w:r>
+        <w:rPr>
+          <w:rFonts w:ascii="Consolas" w:cs="Consolas" w:eastAsia="Consolas" w:hAnsi="Consolas"/>
+          <w:color w:val="9A3412"/>
+          <w:sz w:val="19"/>
+          <w:szCs w:val="19"/>
+        </w:rPr>
+        <w:t xml:space="preserve">ResumenRevision</w:t>
+      </w:r>
+      <w:r>
+        <w:t xml:space="preserve"> arma un único correo para tesorería con los proveedores morosos destacados, cada pago retenido o en revisión con su motivo y los QR de los aprobados, y solo se envía si hay situaciones críticas. Como las ramas del workflow llegan a la bitácora por separado, el nodo </w:t>
+      </w:r>
+      <w:r>
+        <w:rPr>
+          <w:b/>
+          <w:bCs/>
+        </w:rPr>
+        <w:t xml:space="preserve">Preparar notificación (POO)</w:t>
+      </w:r>
+      <w:r>
+        <w:t xml:space="preserve"> espera a que estén registrados todos los pagos (cuenta las corridas con </w:t>
+      </w:r>
+      <w:r>
+        <w:rPr>
+          <w:rFonts w:ascii="Consolas" w:cs="Consolas" w:eastAsia="Consolas" w:hAnsi="Consolas"/>
+          <w:color w:val="9A3412"/>
+          <w:sz w:val="19"/>
+          <w:szCs w:val="19"/>
+        </w:rPr>
+        <w:t xml:space="preserve">$runIndex</w:t>
+      </w:r>
+      <w:r>
+        <w:t xml:space="preserve">) para enviar un solo correo y no tres. Lo probé con un servidor SMTP local; para el envío real usa una cuenta de Gmail por SMTP.</w:t>
       </w:r>
     </w:p>
     <w:sectPr>

</xml_diff>

<commit_message>
Extensión, reto 4: historial y tendencia del riesgo
- Clase HistorialTendencia: índice de riesgo por revisión y comparación con el promedio de las últimas 5
- Workflow: lee /revisiones al inicio, calcula la tendencia, la incluye en el correo y la guarda en la revisión
- Panel: tendencia en Inicio y Avisos por correo, y columna en el historial de revisiones
- 5 pruebas nuevas (35 en total), sección en main.js, README y documento

Co-Authored-By: Claude Opus 5.5 <noreply@anthropic.com>
</commit_message>
<xml_diff>
--- a/docs/documento-logica-negocio.docx
+++ b/docs/documento-logica-negocio.docx
@@ -151,7 +151,7 @@
         <w:jc w:val="both"/>
       </w:pPr>
       <w:r>
-        <w:t xml:space="preserve">El workflow tiene 26 nodos (incluida una nota con el resumen de reglas). El diagrama muestra el recorrido principal de los datos (sin el aviso por correo de la sección 7); los colores indican el tipo de nodo:</w:t>
+        <w:t xml:space="preserve">El workflow tiene 28 nodos (incluida una nota con el resumen de reglas). El diagrama muestra el recorrido principal de los datos (sin el historial y el aviso por correo de la sección 7); los colores indican el tipo de nodo:</w:t>
       </w:r>
     </w:p>
     <w:p>
@@ -2833,61 +2833,6 @@
     </w:p>
     <w:p>
       <w:pPr>
-        <w:spacing w:after="100"/>
-      </w:pPr>
-      <w:r>
-        <w:drawing>
-          <wp:inline distT="0" distB="0" distL="0" distR="0">
-            <wp:extent cx="914400" cy="914400"/>
-            <wp:effectExtent t="0" r="0" b="0" l="0"/>
-            <wp:docPr id="2" name="qr" descr="QR generado para PAG-001" title="Comprobante QR"/>
-            <wp:cNvGraphicFramePr>
-              <a:graphicFrameLocks xmlns:a="http://schemas.openxmlformats.org/drawingml/2006/main" noChangeAspect="1"/>
-            </wp:cNvGraphicFramePr>
-            <a:graphic xmlns:a="http://schemas.openxmlformats.org/drawingml/2006/main">
-              <a:graphicData uri="http://schemas.openxmlformats.org/drawingml/2006/picture">
-                <pic:pic xmlns:pic="http://schemas.openxmlformats.org/drawingml/2006/picture">
-                  <pic:nvPicPr>
-                    <pic:cNvPr id="0" name="" descr=""/>
-                    <pic:cNvPicPr>
-                      <a:picLocks noChangeAspect="1" noChangeArrowheads="1"/>
-                    </pic:cNvPicPr>
-                  </pic:nvPicPr>
-                  <pic:blipFill>
-                    <a:blip r:embed="rId9" cstate="none"/>
-                    <a:srcRect/>
-                    <a:stretch>
-                      <a:fillRect/>
-                    </a:stretch>
-                  </pic:blipFill>
-                  <pic:spPr bwMode="auto">
-                    <a:xfrm>
-                      <a:off x="0" y="0"/>
-                      <a:ext cx="914400" cy="914400"/>
-                    </a:xfrm>
-                    <a:prstGeom prst="rect">
-                      <a:avLst/>
-                    </a:prstGeom>
-                  </pic:spPr>
-                </pic:pic>
-              </a:graphicData>
-            </a:graphic>
-          </wp:inline>
-        </w:drawing>
-      </w:r>
-      <w:r>
-        <w:rPr>
-          <w:i/>
-          <w:iCs/>
-          <w:color w:val="475569"/>
-          <w:sz w:val="18"/>
-          <w:szCs w:val="18"/>
-        </w:rPr>
-        <w:t xml:space="preserve">   Comprobante QR real generado para PAG-001 (Universidad de Costa Rica, ₡850 000).</w:t>
-      </w:r>
-    </w:p>
-    <w:p>
-      <w:pPr>
         <w:spacing w:after="100" w:line="276"/>
         <w:jc w:val="both"/>
       </w:pPr>
@@ -3856,7 +3801,7 @@
         <w:t xml:space="preserve">npm test</w:t>
       </w:r>
       <w:r>
-        <w:t xml:space="preserve"> ejecuta 30 pruebas automatizadas que cubren las reglas R1 a R9, los errores E1 a E4, la consulta de cédula del panel, los pilares de POO y el correo de resumen (E5 y E6 dependen de servicios caídos y se probaron directamente en n8n). </w:t>
+        <w:t xml:space="preserve"> ejecuta 35 pruebas automatizadas que cubren las reglas R1 a R9, los errores E1 a E4, la consulta de cédula del panel, los pilares de POO, el correo de resumen y la tendencia (E5 y E6 dependen de servicios caídos y se probaron directamente en n8n). </w:t>
       </w:r>
       <w:r>
         <w:rPr>
@@ -4037,6 +3982,91 @@
       </w:r>
       <w:r>
         <w:t xml:space="preserve">) para enviar un solo correo y no tres. Lo probé con un servidor SMTP local; para el envío real usa una cuenta de Gmail por SMTP.</w:t>
+      </w:r>
+    </w:p>
+    <w:p>
+      <w:pPr>
+        <w:pStyle w:val="ListParagraph"/>
+        <w:numPr>
+          <w:ilvl w:val="0"/>
+          <w:numId w:val="2"/>
+        </w:numPr>
+        <w:spacing w:after="40" w:line="264"/>
+        <w:jc w:val="both"/>
+      </w:pPr>
+      <w:r>
+        <w:rPr>
+          <w:b/>
+          <w:bCs/>
+        </w:rPr>
+        <w:t xml:space="preserve">Reto 4 · Historial y tendencia.</w:t>
+      </w:r>
+      <w:r>
+        <w:t xml:space="preserve"> Cada revisión queda guardada en la colección </w:t>
+      </w:r>
+      <w:r>
+        <w:rPr>
+          <w:rFonts w:ascii="Consolas" w:cs="Consolas" w:eastAsia="Consolas" w:hAnsi="Consolas"/>
+          <w:color w:val="9A3412"/>
+          <w:sz w:val="19"/>
+          <w:szCs w:val="19"/>
+        </w:rPr>
+        <w:t xml:space="preserve">revisiones</w:t>
+      </w:r>
+      <w:r>
+        <w:t xml:space="preserve"> de JSON Server. Al inicio, el workflow lee las últimas cinco; al final, la clase </w:t>
+      </w:r>
+      <w:r>
+        <w:rPr>
+          <w:rFonts w:ascii="Consolas" w:cs="Consolas" w:eastAsia="Consolas" w:hAnsi="Consolas"/>
+          <w:color w:val="9A3412"/>
+          <w:sz w:val="19"/>
+          <w:szCs w:val="19"/>
+        </w:rPr>
+        <w:t xml:space="preserve">HistorialTendencia</w:t>
+      </w:r>
+      <w:r>
+        <w:t xml:space="preserve"> calcula el índice de riesgo (pagos detenidos o en revisión sobre pagos revisados) y lo compara con el promedio anterior: </w:t>
+      </w:r>
+      <w:r>
+        <w:rPr>
+          <w:b/>
+          <w:bCs/>
+        </w:rPr>
+        <w:t xml:space="preserve">empeorando</w:t>
+      </w:r>
+      <w:r>
+        <w:t xml:space="preserve"> o </w:t>
+      </w:r>
+      <w:r>
+        <w:rPr>
+          <w:b/>
+          <w:bCs/>
+        </w:rPr>
+        <w:t xml:space="preserve">mejorando</w:t>
+      </w:r>
+      <w:r>
+        <w:t xml:space="preserve"> si cambia más de 10 puntos, </w:t>
+      </w:r>
+      <w:r>
+        <w:rPr>
+          <w:b/>
+          <w:bCs/>
+        </w:rPr>
+        <w:t xml:space="preserve">estable</w:t>
+      </w:r>
+      <w:r>
+        <w:t xml:space="preserve"> si no, o </w:t>
+      </w:r>
+      <w:r>
+        <w:rPr>
+          <w:b/>
+          <w:bCs/>
+        </w:rPr>
+        <w:t xml:space="preserve">sin historial</w:t>
+      </w:r>
+      <w:r>
+        <w:t xml:space="preserve"> en la primera revisión. La conclusión va en el correo, en la revisión guardada y en el panel.</w:t>
       </w:r>
     </w:p>
     <w:sectPr>

</xml_diff>